<commit_message>
feat: complete 40-page academic thesis report, distributed honeynet cluster, and architecture diagrams
</commit_message>
<xml_diff>
--- a/reports/BAO_CAO_DO_AN_ACTIVE_DEFENSE_SOAR_40_TRANG.docx
+++ b/reports/BAO_CAO_DO_AN_ACTIVE_DEFENSE_SOAR_40_TRANG.docx
@@ -11,19 +11,17 @@
         <w:rPr>
           <w:rFonts w:ascii="Times New Roman" w:hAnsi="Times New Roman"/>
           <w:b/>
-          <w:sz w:val="26"/>
+          <w:sz w:val="28"/>
         </w:rPr>
-        <w:t>BỘ GIÁO DỤC VÀ ĐÀO TẠO</w:t>
+        <w:t>HỌC VIỆN CÔNG NGHỆ BƯU CHÍNH VIỄN THÔNG</w:t>
         <w:br/>
-        <w:t>TRƯỜNG ĐẠI HỌC KỸ THUẬT - CÔNG NGHỆ</w:t>
-        <w:br/>
-        <w:t>KHOA AN TOÀN THÔNG TIN &amp; MẠNG MÁY TÍNH</w:t>
+        <w:t>KHOA AN TOÀN THÔNG TIN</w:t>
         <w:br/>
       </w:r>
     </w:p>
     <w:p>
       <w:pPr>
-        <w:spacing w:after="720"/>
+        <w:spacing w:after="600"/>
         <w:jc w:val="center"/>
       </w:pPr>
       <w:r>
@@ -45,7 +43,9 @@
           <w:color w:val="003366"/>
           <w:sz w:val="30"/>
         </w:rPr>
-        <w:t>BÁO CÁO ĐỒ ÁN CHUYÊN NGÀNH AN TOÀN THÔNG TIN</w:t>
+        <w:t>BÁO CÁO BÀI TẬP LỚN</w:t>
+        <w:br/>
+        <w:t>HỌC PHẦN: HỆ ĐIỀU HÀNH WINDOWS VÀ LINUX/UNIX (INT1487)</w:t>
         <w:br/>
       </w:r>
     </w:p>
@@ -94,13 +94,13 @@
           <w:rFonts w:ascii="Times New Roman" w:hAnsi="Times New Roman"/>
           <w:sz w:val="26"/>
         </w:rPr>
-        <w:t>Sinh viên thực hiện   : [Họ và tên sinh viên]</w:t>
+        <w:t>Họ và tên sinh viên   : NGUYỄN GIA HÀO</w:t>
         <w:br/>
-        <w:t>Mã số sinh viên       : [MSSV]</w:t>
+        <w:t>Mã số sinh viên       : B24DCAT088</w:t>
         <w:br/>
-        <w:t>Lớp chuyên ngành      : An toàn Thông tin K17 / K18</w:t>
+        <w:t>Tên lớp               : INT1487-20261-03</w:t>
         <w:br/>
-        <w:t>Giảng viên hướng dẫn  : [Học hàm, Học vị, Họ và tên Giảng viên]</w:t>
+        <w:t>Giảng viên hướng dẫn  : ThS. Quản Trọng Thế</w:t>
         <w:br/>
         <w:t>Bộ môn                : An toàn Hệ thống và Tác chiến Không gian mạng</w:t>
       </w:r>
@@ -1800,7 +1800,7 @@
                 <w:rFonts w:ascii="Times New Roman" w:hAnsi="Times New Roman"/>
                 <w:sz w:val="21"/>
               </w:rPr>
-              <w:t>Hình 5.1</w:t>
+              <w:t>Hình 3.5</w:t>
             </w:r>
           </w:p>
         </w:tc>
@@ -1818,7 +1818,7 @@
                 <w:rFonts w:ascii="Times New Roman" w:hAnsi="Times New Roman"/>
                 <w:sz w:val="21"/>
               </w:rPr>
-              <w:t>Biểu đồ phân bố Kỹ thuật Tấn công ghi nhận trên Cowrie (Chuẩn MITRE ATT&amp;CK)</w:t>
+              <w:t>Sơ đồ Kiến trúc Mạng Bẫy Mồi Phân tán (Distributed Honeynet Cluster Architecture)</w:t>
             </w:r>
           </w:p>
         </w:tc>
@@ -1826,6 +1826,59 @@
           <w:tcPr>
             <w:tcW w:type="dxa" w:w="3134"/>
             <w:shd w:val="clear" w:color="auto" w:fill="F2F5F8"/>
+          </w:tcPr>
+          <w:p>
+            <w:pPr>
+              <w:jc w:val="left"/>
+            </w:pPr>
+            <w:r>
+              <w:rPr>
+                <w:rFonts w:ascii="Times New Roman" w:hAnsi="Times New Roman"/>
+                <w:sz w:val="21"/>
+              </w:rPr>
+              <w:t>31</w:t>
+            </w:r>
+          </w:p>
+        </w:tc>
+      </w:tr>
+      <w:tr>
+        <w:tc>
+          <w:tcPr>
+            <w:tcW w:type="dxa" w:w="3134"/>
+          </w:tcPr>
+          <w:p>
+            <w:pPr>
+              <w:jc w:val="center"/>
+            </w:pPr>
+            <w:r>
+              <w:rPr>
+                <w:rFonts w:ascii="Times New Roman" w:hAnsi="Times New Roman"/>
+                <w:sz w:val="21"/>
+              </w:rPr>
+              <w:t>Hình 5.1</w:t>
+            </w:r>
+          </w:p>
+        </w:tc>
+        <w:tc>
+          <w:tcPr>
+            <w:tcW w:type="dxa" w:w="3134"/>
+          </w:tcPr>
+          <w:p>
+            <w:pPr>
+              <w:jc w:val="left"/>
+            </w:pPr>
+            <w:r>
+              <w:rPr>
+                <w:rFonts w:ascii="Times New Roman" w:hAnsi="Times New Roman"/>
+                <w:sz w:val="21"/>
+              </w:rPr>
+              <w:t>Đo lường Hiệu quả Làm chậm &amp; Triệt tiêu Tấn công của Cơ chế Tarpit</w:t>
+            </w:r>
+          </w:p>
+        </w:tc>
+        <w:tc>
+          <w:tcPr>
+            <w:tcW w:type="dxa" w:w="3134"/>
           </w:tcPr>
           <w:p>
             <w:pPr>
@@ -1845,6 +1898,7 @@
         <w:tc>
           <w:tcPr>
             <w:tcW w:type="dxa" w:w="3134"/>
+            <w:shd w:val="clear" w:color="auto" w:fill="F2F5F8"/>
           </w:tcPr>
           <w:p>
             <w:pPr>
@@ -1862,6 +1916,7 @@
         <w:tc>
           <w:tcPr>
             <w:tcW w:type="dxa" w:w="3134"/>
+            <w:shd w:val="clear" w:color="auto" w:fill="F2F5F8"/>
           </w:tcPr>
           <w:p>
             <w:pPr>
@@ -1879,6 +1934,7 @@
         <w:tc>
           <w:tcPr>
             <w:tcW w:type="dxa" w:w="3134"/>
+            <w:shd w:val="clear" w:color="auto" w:fill="F2F5F8"/>
           </w:tcPr>
           <w:p>
             <w:pPr>
@@ -1898,7 +1954,6 @@
         <w:tc>
           <w:tcPr>
             <w:tcW w:type="dxa" w:w="3134"/>
-            <w:shd w:val="clear" w:color="auto" w:fill="F2F5F8"/>
           </w:tcPr>
           <w:p>
             <w:pPr>
@@ -1916,7 +1971,6 @@
         <w:tc>
           <w:tcPr>
             <w:tcW w:type="dxa" w:w="3134"/>
-            <w:shd w:val="clear" w:color="auto" w:fill="F2F5F8"/>
           </w:tcPr>
           <w:p>
             <w:pPr>
@@ -1927,14 +1981,13 @@
                 <w:rFonts w:ascii="Times New Roman" w:hAnsi="Times New Roman"/>
                 <w:sz w:val="21"/>
               </w:rPr>
-              <w:t>Đo lường Hiệu quả Làm chậm &amp; Triệt tiêu Tấn công của Cơ chế Tarpit</w:t>
+              <w:t>Biểu đồ phân bố Kỹ thuật Tấn công ghi nhận trên Cowrie (Chuẩn MITRE ATT&amp;CK)</w:t>
             </w:r>
           </w:p>
         </w:tc>
         <w:tc>
           <w:tcPr>
             <w:tcW w:type="dxa" w:w="3134"/>
-            <w:shd w:val="clear" w:color="auto" w:fill="F2F5F8"/>
           </w:tcPr>
           <w:p>
             <w:pPr>
@@ -4675,6 +4728,60 @@
     </w:p>
     <w:p>
       <w:pPr>
+        <w:spacing w:before="160" w:after="80"/>
+        <w:jc w:val="center"/>
+      </w:pPr>
+      <w:r>
+        <w:drawing>
+          <wp:inline xmlns:a="http://schemas.openxmlformats.org/drawingml/2006/main" xmlns:pic="http://schemas.openxmlformats.org/drawingml/2006/picture">
+            <wp:extent cx="5486400" cy="3092335"/>
+            <wp:docPr id="1" name="Picture 1"/>
+            <wp:cNvGraphicFramePr>
+              <a:graphicFrameLocks noChangeAspect="1"/>
+            </wp:cNvGraphicFramePr>
+            <a:graphic>
+              <a:graphicData uri="http://schemas.openxmlformats.org/drawingml/2006/picture">
+                <pic:pic>
+                  <pic:nvPicPr>
+                    <pic:cNvPr id="0" name="hinh_2_1_phan_loai_honeypot.png"/>
+                    <pic:cNvPicPr/>
+                  </pic:nvPicPr>
+                  <pic:blipFill>
+                    <a:blip r:embed="rId9"/>
+                    <a:stretch>
+                      <a:fillRect/>
+                    </a:stretch>
+                  </pic:blipFill>
+                  <pic:spPr>
+                    <a:xfrm>
+                      <a:off x="0" y="0"/>
+                      <a:ext cx="5486400" cy="3092335"/>
+                    </a:xfrm>
+                    <a:prstGeom prst="rect"/>
+                  </pic:spPr>
+                </pic:pic>
+              </a:graphicData>
+            </a:graphic>
+          </wp:inline>
+        </w:drawing>
+      </w:r>
+    </w:p>
+    <w:p>
+      <w:pPr>
+        <w:spacing w:before="40" w:after="160"/>
+        <w:jc w:val="center"/>
+      </w:pPr>
+      <w:r>
+        <w:rPr>
+          <w:rFonts w:ascii="Times New Roman" w:hAnsi="Times New Roman"/>
+          <w:i/>
+          <w:sz w:val="22"/>
+        </w:rPr>
+        <w:t>Hình 2.1: Mô hình phân loại Honeypot theo mức độ tương tác (Low, Medium, High)</w:t>
+      </w:r>
+    </w:p>
+    <w:p>
+      <w:pPr>
         <w:keepNext/>
         <w:spacing w:before="240" w:after="120"/>
         <w:jc w:val="left"/>
@@ -4792,6 +4899,60 @@
           <w:sz w:val="26"/>
         </w:rPr>
         <w:t>5. TTY Recording &amp; Structured JSON Logging: Mọi thao tác gõ phím của kẻ tấn công đều được ghi lại dưới định dạng TTY log (cho phép xem lại như một đoạn video tua lại bằng lệnh 'bin/playlog') và toàn bộ metadata sự kiện được xuất ra tệp tin cấu trúc 'cowrie.json' thời gian thực.</w:t>
+      </w:r>
+    </w:p>
+    <w:p>
+      <w:pPr>
+        <w:spacing w:before="160" w:after="80"/>
+        <w:jc w:val="center"/>
+      </w:pPr>
+      <w:r>
+        <w:drawing>
+          <wp:inline xmlns:a="http://schemas.openxmlformats.org/drawingml/2006/main" xmlns:pic="http://schemas.openxmlformats.org/drawingml/2006/picture">
+            <wp:extent cx="5486400" cy="3092335"/>
+            <wp:docPr id="2" name="Picture 2"/>
+            <wp:cNvGraphicFramePr>
+              <a:graphicFrameLocks noChangeAspect="1"/>
+            </wp:cNvGraphicFramePr>
+            <a:graphic>
+              <a:graphicData uri="http://schemas.openxmlformats.org/drawingml/2006/picture">
+                <pic:pic>
+                  <pic:nvPicPr>
+                    <pic:cNvPr id="0" name="hinh_2_2_kien_truc_cowrie.png"/>
+                    <pic:cNvPicPr/>
+                  </pic:nvPicPr>
+                  <pic:blipFill>
+                    <a:blip r:embed="rId10"/>
+                    <a:stretch>
+                      <a:fillRect/>
+                    </a:stretch>
+                  </pic:blipFill>
+                  <pic:spPr>
+                    <a:xfrm>
+                      <a:off x="0" y="0"/>
+                      <a:ext cx="5486400" cy="3092335"/>
+                    </a:xfrm>
+                    <a:prstGeom prst="rect"/>
+                  </pic:spPr>
+                </pic:pic>
+              </a:graphicData>
+            </a:graphic>
+          </wp:inline>
+        </w:drawing>
+      </w:r>
+    </w:p>
+    <w:p>
+      <w:pPr>
+        <w:spacing w:before="40" w:after="160"/>
+        <w:jc w:val="center"/>
+      </w:pPr>
+      <w:r>
+        <w:rPr>
+          <w:rFonts w:ascii="Times New Roman" w:hAnsi="Times New Roman"/>
+          <w:i/>
+          <w:sz w:val="22"/>
+        </w:rPr>
+        <w:t>Hình 2.2: Kiến trúc mô phỏng hệ thống tệp và lệnh của Cowrie Honeypot</w:t>
       </w:r>
     </w:p>
     <w:p>
@@ -5531,6 +5692,60 @@
     </w:p>
     <w:p>
       <w:pPr>
+        <w:spacing w:before="160" w:after="80"/>
+        <w:jc w:val="center"/>
+      </w:pPr>
+      <w:r>
+        <w:drawing>
+          <wp:inline xmlns:a="http://schemas.openxmlformats.org/drawingml/2006/main" xmlns:pic="http://schemas.openxmlformats.org/drawingml/2006/picture">
+            <wp:extent cx="5486400" cy="3092335"/>
+            <wp:docPr id="3" name="Picture 3"/>
+            <wp:cNvGraphicFramePr>
+              <a:graphicFrameLocks noChangeAspect="1"/>
+            </wp:cNvGraphicFramePr>
+            <a:graphic>
+              <a:graphicData uri="http://schemas.openxmlformats.org/drawingml/2006/picture">
+                <pic:pic>
+                  <pic:nvPicPr>
+                    <pic:cNvPr id="0" name="hinh_2_3_vong_doi_nist_soar.png"/>
+                    <pic:cNvPicPr/>
+                  </pic:nvPicPr>
+                  <pic:blipFill>
+                    <a:blip r:embed="rId11"/>
+                    <a:stretch>
+                      <a:fillRect/>
+                    </a:stretch>
+                  </pic:blipFill>
+                  <pic:spPr>
+                    <a:xfrm>
+                      <a:off x="0" y="0"/>
+                      <a:ext cx="5486400" cy="3092335"/>
+                    </a:xfrm>
+                    <a:prstGeom prst="rect"/>
+                  </pic:spPr>
+                </pic:pic>
+              </a:graphicData>
+            </a:graphic>
+          </wp:inline>
+        </w:drawing>
+      </w:r>
+    </w:p>
+    <w:p>
+      <w:pPr>
+        <w:spacing w:before="40" w:after="160"/>
+        <w:jc w:val="center"/>
+      </w:pPr>
+      <w:r>
+        <w:rPr>
+          <w:rFonts w:ascii="Times New Roman" w:hAnsi="Times New Roman"/>
+          <w:i/>
+          <w:sz w:val="22"/>
+        </w:rPr>
+        <w:t>Hình 2.3: Vòng đời xử lý sự cố an ninh chuẩn NIST SP 800-61 r2 tích hợp SOAR</w:t>
+      </w:r>
+    </w:p>
+    <w:p>
+      <w:pPr>
         <w:keepNext/>
         <w:spacing w:before="240" w:after="120"/>
         <w:jc w:val="left"/>
@@ -5911,6 +6126,60 @@
           <w:sz w:val="26"/>
         </w:rPr>
         <w:t>• Tầng 5: Lớp Giám sát &amp; Điều khiển Tương tác 2 Chiều (Bidirectional Command &amp; Monitoring Layer) - Cung cấp giao diện trực quan thông qua Telegram SOAR Bot với các nút bấm tương tác (Inline Buttons), cho phép chuyên viên SOC can thiệp và kích hoạt các hành động phòng thủ chỉ bằng một chạm.</w:t>
+      </w:r>
+    </w:p>
+    <w:p>
+      <w:pPr>
+        <w:spacing w:before="160" w:after="80"/>
+        <w:jc w:val="center"/>
+      </w:pPr>
+      <w:r>
+        <w:drawing>
+          <wp:inline xmlns:a="http://schemas.openxmlformats.org/drawingml/2006/main" xmlns:pic="http://schemas.openxmlformats.org/drawingml/2006/picture">
+            <wp:extent cx="5486400" cy="3591098"/>
+            <wp:docPr id="4" name="Picture 4"/>
+            <wp:cNvGraphicFramePr>
+              <a:graphicFrameLocks noChangeAspect="1"/>
+            </wp:cNvGraphicFramePr>
+            <a:graphic>
+              <a:graphicData uri="http://schemas.openxmlformats.org/drawingml/2006/picture">
+                <pic:pic>
+                  <pic:nvPicPr>
+                    <pic:cNvPr id="0" name="hinh_3_1_kien_truc_5_phan_lop.png"/>
+                    <pic:cNvPicPr/>
+                  </pic:nvPicPr>
+                  <pic:blipFill>
+                    <a:blip r:embed="rId12"/>
+                    <a:stretch>
+                      <a:fillRect/>
+                    </a:stretch>
+                  </pic:blipFill>
+                  <pic:spPr>
+                    <a:xfrm>
+                      <a:off x="0" y="0"/>
+                      <a:ext cx="5486400" cy="3591098"/>
+                    </a:xfrm>
+                    <a:prstGeom prst="rect"/>
+                  </pic:spPr>
+                </pic:pic>
+              </a:graphicData>
+            </a:graphic>
+          </wp:inline>
+        </w:drawing>
+      </w:r>
+    </w:p>
+    <w:p>
+      <w:pPr>
+        <w:spacing w:before="40" w:after="160"/>
+        <w:jc w:val="center"/>
+      </w:pPr>
+      <w:r>
+        <w:rPr>
+          <w:rFonts w:ascii="Times New Roman" w:hAnsi="Times New Roman"/>
+          <w:i/>
+          <w:sz w:val="22"/>
+        </w:rPr>
+        <w:t>Hình 3.1: Sơ đồ kiến trúc tổng thể 5 phân lớp của Hệ sinh thái Active Defense &amp; SOAR</w:t>
       </w:r>
     </w:p>
     <w:p>
@@ -6777,6 +7046,60 @@
     </w:p>
     <w:p>
       <w:pPr>
+        <w:spacing w:before="160" w:after="80"/>
+        <w:jc w:val="center"/>
+      </w:pPr>
+      <w:r>
+        <w:drawing>
+          <wp:inline xmlns:a="http://schemas.openxmlformats.org/drawingml/2006/main" xmlns:pic="http://schemas.openxmlformats.org/drawingml/2006/picture">
+            <wp:extent cx="5486400" cy="3086100"/>
+            <wp:docPr id="5" name="Picture 5"/>
+            <wp:cNvGraphicFramePr>
+              <a:graphicFrameLocks noChangeAspect="1"/>
+            </wp:cNvGraphicFramePr>
+            <a:graphic>
+              <a:graphicData uri="http://schemas.openxmlformats.org/drawingml/2006/picture">
+                <pic:pic>
+                  <pic:nvPicPr>
+                    <pic:cNvPr id="0" name="02_correlation_engine_flowchart.png"/>
+                    <pic:cNvPicPr/>
+                  </pic:nvPicPr>
+                  <pic:blipFill>
+                    <a:blip r:embed="rId13"/>
+                    <a:stretch>
+                      <a:fillRect/>
+                    </a:stretch>
+                  </pic:blipFill>
+                  <pic:spPr>
+                    <a:xfrm>
+                      <a:off x="0" y="0"/>
+                      <a:ext cx="5486400" cy="3086100"/>
+                    </a:xfrm>
+                    <a:prstGeom prst="rect"/>
+                  </pic:spPr>
+                </pic:pic>
+              </a:graphicData>
+            </a:graphic>
+          </wp:inline>
+        </w:drawing>
+      </w:r>
+    </w:p>
+    <w:p>
+      <w:pPr>
+        <w:spacing w:before="40" w:after="160"/>
+        <w:jc w:val="center"/>
+      </w:pPr>
+      <w:r>
+        <w:rPr>
+          <w:rFonts w:ascii="Times New Roman" w:hAnsi="Times New Roman"/>
+          <w:i/>
+          <w:sz w:val="22"/>
+        </w:rPr>
+        <w:t>Hình 3.2: Lưu đồ thuật toán Động cơ Tương quan Sự kiện và Ánh xạ MITRE ATT&amp;CK</w:t>
+      </w:r>
+    </w:p>
+    <w:p>
+      <w:pPr>
         <w:keepNext/>
         <w:spacing w:before="240" w:after="120"/>
         <w:jc w:val="left"/>
@@ -7019,6 +7342,60 @@
     </w:p>
     <w:p>
       <w:pPr>
+        <w:spacing w:before="160" w:after="80"/>
+        <w:jc w:val="center"/>
+      </w:pPr>
+      <w:r>
+        <w:drawing>
+          <wp:inline xmlns:a="http://schemas.openxmlformats.org/drawingml/2006/main" xmlns:pic="http://schemas.openxmlformats.org/drawingml/2006/picture">
+            <wp:extent cx="5486400" cy="3086100"/>
+            <wp:docPr id="6" name="Picture 6"/>
+            <wp:cNvGraphicFramePr>
+              <a:graphicFrameLocks noChangeAspect="1"/>
+            </wp:cNvGraphicFramePr>
+            <a:graphic>
+              <a:graphicData uri="http://schemas.openxmlformats.org/drawingml/2006/picture">
+                <pic:pic>
+                  <pic:nvPicPr>
+                    <pic:cNvPr id="0" name="03_deanonymization_sequence.png"/>
+                    <pic:cNvPicPr/>
+                  </pic:nvPicPr>
+                  <pic:blipFill>
+                    <a:blip r:embed="rId14"/>
+                    <a:stretch>
+                      <a:fillRect/>
+                    </a:stretch>
+                  </pic:blipFill>
+                  <pic:spPr>
+                    <a:xfrm>
+                      <a:off x="0" y="0"/>
+                      <a:ext cx="5486400" cy="3086100"/>
+                    </a:xfrm>
+                    <a:prstGeom prst="rect"/>
+                  </pic:spPr>
+                </pic:pic>
+              </a:graphicData>
+            </a:graphic>
+          </wp:inline>
+        </w:drawing>
+      </w:r>
+    </w:p>
+    <w:p>
+      <w:pPr>
+        <w:spacing w:before="40" w:after="160"/>
+        <w:jc w:val="center"/>
+      </w:pPr>
+      <w:r>
+        <w:rPr>
+          <w:rFonts w:ascii="Times New Roman" w:hAnsi="Times New Roman"/>
+          <w:i/>
+          <w:sz w:val="22"/>
+        </w:rPr>
+        <w:t>Hình 3.3: Cơ chế bẫy mồi Honeytoken và khử ẩn danh kẻ tấn công (De-anonymization)</w:t>
+      </w:r>
+    </w:p>
+    <w:p>
+      <w:pPr>
         <w:keepNext/>
         <w:spacing w:before="240" w:after="120"/>
         <w:jc w:val="left"/>
@@ -7319,6 +7696,683 @@
         </w:rPr>
         <w:t>Cơ chế này giúp chuyên viên SOC có thể điều hành tác chiến từ bất kỳ đâu thông qua điện thoại thông minh mà không cần phải mở máy tính và đăng nhập vào máy chủ.</w:t>
       </w:r>
+    </w:p>
+    <w:p>
+      <w:pPr>
+        <w:spacing w:before="160" w:after="80"/>
+        <w:jc w:val="center"/>
+      </w:pPr>
+      <w:r>
+        <w:drawing>
+          <wp:inline xmlns:a="http://schemas.openxmlformats.org/drawingml/2006/main" xmlns:pic="http://schemas.openxmlformats.org/drawingml/2006/picture">
+            <wp:extent cx="5303520" cy="3447288"/>
+            <wp:docPr id="7" name="Picture 7"/>
+            <wp:cNvGraphicFramePr>
+              <a:graphicFrameLocks noChangeAspect="1"/>
+            </wp:cNvGraphicFramePr>
+            <a:graphic>
+              <a:graphicData uri="http://schemas.openxmlformats.org/drawingml/2006/picture">
+                <pic:pic>
+                  <pic:nvPicPr>
+                    <pic:cNvPr id="0" name="hinh_3_4_telegram_bot_interface.png"/>
+                    <pic:cNvPicPr/>
+                  </pic:nvPicPr>
+                  <pic:blipFill>
+                    <a:blip r:embed="rId15"/>
+                    <a:stretch>
+                      <a:fillRect/>
+                    </a:stretch>
+                  </pic:blipFill>
+                  <pic:spPr>
+                    <a:xfrm>
+                      <a:off x="0" y="0"/>
+                      <a:ext cx="5303520" cy="3447288"/>
+                    </a:xfrm>
+                    <a:prstGeom prst="rect"/>
+                  </pic:spPr>
+                </pic:pic>
+              </a:graphicData>
+            </a:graphic>
+          </wp:inline>
+        </w:drawing>
+      </w:r>
+    </w:p>
+    <w:p>
+      <w:pPr>
+        <w:spacing w:before="40" w:after="160"/>
+        <w:jc w:val="center"/>
+      </w:pPr>
+      <w:r>
+        <w:rPr>
+          <w:rFonts w:ascii="Times New Roman" w:hAnsi="Times New Roman"/>
+          <w:i/>
+          <w:sz w:val="22"/>
+        </w:rPr>
+        <w:t>Hình 3.4: Giao diện Thẻ cảnh báo và Bàn phím tương tác Inline Buttons của Telegram SOAR Bot</w:t>
+      </w:r>
+    </w:p>
+    <w:p>
+      <w:pPr>
+        <w:keepNext/>
+        <w:spacing w:before="240" w:after="120"/>
+        <w:jc w:val="left"/>
+      </w:pPr>
+      <w:r>
+        <w:rPr>
+          <w:rFonts w:ascii="Times New Roman" w:hAnsi="Times New Roman"/>
+          <w:b/>
+          <w:color w:val="142850"/>
+          <w:sz w:val="28"/>
+        </w:rPr>
+        <w:t>3.9 Thiết kế Kiến trúc Mạng Bẫy Mồi Phân tán (Distributed Honeynet Architecture)</w:t>
+      </w:r>
+    </w:p>
+    <w:p>
+      <w:pPr>
+        <w:spacing w:line="360" w:lineRule="auto" w:after="120"/>
+        <w:ind w:firstLine="576"/>
+        <w:jc w:val="both"/>
+      </w:pPr>
+      <w:r>
+        <w:rPr>
+          <w:rFonts w:ascii="Times New Roman" w:hAnsi="Times New Roman"/>
+          <w:color w:val="1E1E1E"/>
+          <w:sz w:val="26"/>
+        </w:rPr>
+        <w:t>Trong môi trường hạ tầng mạng doanh nghiệp hiện đại hoặc mô hình điện toán đám mây lai (Hybrid Cloud), việc triển khai Honeypot đơn điểm (Single Honeypot Instance) bộc lộ hạn chế lớn về tầm nhìn chiến thuật (tactical visibility). Nếu chỉ đặt bẫy tại một địa chỉ IP duy nhất, hệ thống không thể giám sát được các kỹ thuật di chuyển ngang (Lateral Movement) hoặc hoạt động dò quét trinh sát phân tán (Cross-Subnet Probing). Nhằm khắc phục triệt để rào cản này, kiến trúc Honeynet Phân tán (Distributed Honeynet Architecture) được thiết kế và tích hợp trực tiếp vào nhân điều phối.</w:t>
+      </w:r>
+    </w:p>
+    <w:p>
+      <w:pPr>
+        <w:spacing w:line="360" w:lineRule="auto" w:after="120"/>
+        <w:ind w:firstLine="576"/>
+        <w:jc w:val="both"/>
+      </w:pPr>
+      <w:r>
+        <w:rPr>
+          <w:rFonts w:ascii="Times New Roman" w:hAnsi="Times New Roman"/>
+          <w:color w:val="1E1E1E"/>
+          <w:sz w:val="26"/>
+        </w:rPr>
+        <w:t>Mô hình bao gồm các thành phần cốt lõi được chuẩn hóa theo chuẩn kiến trúc mở:</w:t>
+      </w:r>
+    </w:p>
+    <w:p>
+      <w:pPr>
+        <w:spacing w:line="360" w:lineRule="auto" w:after="120"/>
+        <w:ind w:firstLine="576"/>
+        <w:jc w:val="both"/>
+      </w:pPr>
+      <w:r>
+        <w:rPr>
+          <w:rFonts w:ascii="Times New Roman" w:hAnsi="Times New Roman"/>
+          <w:color w:val="1E1E1E"/>
+          <w:sz w:val="26"/>
+        </w:rPr>
+        <w:t>1. Cụm Cảm biến Biên Đa phân vùng (Distributed Edge Sensor Nodes): Các tác tử cảm biến (Sensor Agents) được phân bổ tại các vị trí nhạy cảm trong hệ thống mạng, bao gồm phân vùng DMZ công khai, phân vùng Đám mây AWS VPC và phân vùng Mạng nội bộ Doanh nghiệp (Corporate LAN). Mỗi cảm biến được định danh duy nhất (node_id) và gán nhãn phân vùng mạng (subnet tag).</w:t>
+      </w:r>
+    </w:p>
+    <w:p>
+      <w:pPr>
+        <w:spacing w:line="360" w:lineRule="auto" w:after="120"/>
+        <w:ind w:firstLine="576"/>
+        <w:jc w:val="both"/>
+      </w:pPr>
+      <w:r>
+        <w:rPr>
+          <w:rFonts w:ascii="Times New Roman" w:hAnsi="Times New Roman"/>
+          <w:color w:val="1E1E1E"/>
+          <w:sz w:val="26"/>
+        </w:rPr>
+        <w:t>2. Giao thức Truyền tin &amp; Xác thực Biên an toàn (Secure REST Ingestion Protocol): Toàn bộ dữ liệu nhật ký sự kiện và trạng thái sức khỏe từ các Cảm biến Biên được gửi về Máy chủ Thu thập Trung tâm (Collector Server) thông qua giao thức HTTPS REST API tại cổng 9090. Kênh giao tiếp được bảo vệ nghiêm ngặt bằng Header xác thực 'X-Honeynet-Token' với cơ chế so khớp băm an toàn hmac.compare_digest(), ngăn chặn hoàn toàn nguy cơ giả mạo cảm biến (Sensor Spoofing).</w:t>
+      </w:r>
+    </w:p>
+    <w:p>
+      <w:pPr>
+        <w:spacing w:line="360" w:lineRule="auto" w:after="120"/>
+        <w:ind w:firstLine="576"/>
+        <w:jc w:val="both"/>
+      </w:pPr>
+      <w:r>
+        <w:rPr>
+          <w:rFonts w:ascii="Times New Roman" w:hAnsi="Times New Roman"/>
+          <w:color w:val="1E1E1E"/>
+          <w:sz w:val="26"/>
+        </w:rPr>
+        <w:t>3. Cơ chế Giám sát Sức khỏe &amp; Chống mất mát Dữ liệu (Heartbeat &amp; Resiliency): Các cảm biến duy trì nhịp tim (Heartbeat) định kỳ 30 giây gửi về Collector. Nếu một cảm biến mất kết nối quá thời gian quy định, hệ thống tự động ghi nhận trạng thái OFFLINE và gửi thông báo cảnh báo về SOC. Phía cảm biến hỗ trợ hàng đợi đệm (Event Buffer Queue) giúp lưu trữ tạm thời sự kiện khi mạng gián đoạn và tự động đồng bộ lại khi kết nối phục hồi.</w:t>
+      </w:r>
+    </w:p>
+    <w:p>
+      <w:pPr>
+        <w:spacing w:line="360" w:lineRule="auto" w:after="120"/>
+        <w:ind w:firstLine="576"/>
+        <w:jc w:val="both"/>
+      </w:pPr>
+      <w:r>
+        <w:rPr>
+          <w:rFonts w:ascii="Times New Roman" w:hAnsi="Times New Roman"/>
+          <w:color w:val="1E1E1E"/>
+          <w:sz w:val="26"/>
+        </w:rPr>
+        <w:t>4. Thuật toán Tương quan Dò quét Xuyên Phân vùng (Cross-Subnet Probing Correlation): Khi một địa chỉ IP nguồn thực hiện dò quét hoặc tương tác với từ 2 phân vùng mạng khác nhau trở lên, Correlation Engine lập tức kích hoạt Luật tương quan đặc biệt 'ALT-DISTRIB' tương ứng với Kỹ thuật MITRE ATT&amp;CK T1046 (Network Service Discovery: Distributed Multi-Node Scanning), tự động cộng dồn +35 điểm rủi ro và kích hoạt Playbook ngăn chặn đồng loạt trên toàn bộ các tường lửa biên.</w:t>
+      </w:r>
+    </w:p>
+    <w:p>
+      <w:pPr>
+        <w:spacing w:before="160" w:after="80"/>
+        <w:jc w:val="center"/>
+      </w:pPr>
+      <w:r>
+        <w:drawing>
+          <wp:inline xmlns:a="http://schemas.openxmlformats.org/drawingml/2006/main" xmlns:pic="http://schemas.openxmlformats.org/drawingml/2006/picture">
+            <wp:extent cx="5669280" cy="3472434"/>
+            <wp:docPr id="8" name="Picture 8"/>
+            <wp:cNvGraphicFramePr>
+              <a:graphicFrameLocks noChangeAspect="1"/>
+            </wp:cNvGraphicFramePr>
+            <a:graphic>
+              <a:graphicData uri="http://schemas.openxmlformats.org/drawingml/2006/picture">
+                <pic:pic>
+                  <pic:nvPicPr>
+                    <pic:cNvPr id="0" name="so_do_honeynet_phan_tan_bw.png"/>
+                    <pic:cNvPicPr/>
+                  </pic:nvPicPr>
+                  <pic:blipFill>
+                    <a:blip r:embed="rId16"/>
+                    <a:stretch>
+                      <a:fillRect/>
+                    </a:stretch>
+                  </pic:blipFill>
+                  <pic:spPr>
+                    <a:xfrm>
+                      <a:off x="0" y="0"/>
+                      <a:ext cx="5669280" cy="3472434"/>
+                    </a:xfrm>
+                    <a:prstGeom prst="rect"/>
+                  </pic:spPr>
+                </pic:pic>
+              </a:graphicData>
+            </a:graphic>
+          </wp:inline>
+        </w:drawing>
+      </w:r>
+    </w:p>
+    <w:p>
+      <w:pPr>
+        <w:spacing w:before="40" w:after="160"/>
+        <w:jc w:val="center"/>
+      </w:pPr>
+      <w:r>
+        <w:rPr>
+          <w:rFonts w:ascii="Times New Roman" w:hAnsi="Times New Roman"/>
+          <w:i/>
+          <w:sz w:val="22"/>
+        </w:rPr>
+        <w:t>Hình 3.5: Sơ đồ Kiến trúc Mạng Bẫy Mồi Phân tán (Distributed Honeynet Cluster Architecture)</w:t>
+      </w:r>
+    </w:p>
+    <w:p>
+      <w:pPr>
+        <w:spacing w:before="120" w:after="80"/>
+        <w:jc w:val="center"/>
+      </w:pPr>
+      <w:r>
+        <w:rPr>
+          <w:rFonts w:ascii="Times New Roman" w:hAnsi="Times New Roman"/>
+          <w:b/>
+          <w:color w:val="003366"/>
+          <w:sz w:val="23"/>
+        </w:rPr>
+        <w:t>Bảng 3.2: Danh mục Phân bổ Cảm biến Biên và Chiến lược Mồi nhử trong Cụm Honeynet Phân tán</w:t>
+      </w:r>
+    </w:p>
+    <w:tbl>
+      <w:tblPr>
+        <w:tblStyle w:val="TableGrid"/>
+        <w:tblW w:type="auto" w:w="0"/>
+        <w:jc w:val="center"/>
+        <w:tblLook w:firstColumn="1" w:firstRow="1" w:lastColumn="0" w:lastRow="0" w:noHBand="0" w:noVBand="1" w:val="04A0"/>
+        <w:tblCellMar>
+          <w:top w:w="80" w:type="dxa"/>
+          <w:left w:w="120" w:type="dxa"/>
+          <w:bottom w:w="80" w:type="dxa"/>
+          <w:right w:w="120" w:type="dxa"/>
+        </w:tblCellMar>
+      </w:tblPr>
+      <w:tblGrid>
+        <w:gridCol w:w="1881"/>
+        <w:gridCol w:w="1881"/>
+        <w:gridCol w:w="1881"/>
+        <w:gridCol w:w="1881"/>
+        <w:gridCol w:w="1881"/>
+      </w:tblGrid>
+      <w:tr>
+        <w:tc>
+          <w:tcPr>
+            <w:tcW w:type="dxa" w:w="1881"/>
+            <w:shd w:val="clear" w:color="auto" w:fill="1F497D"/>
+          </w:tcPr>
+          <w:p>
+            <w:pPr>
+              <w:jc w:val="center"/>
+            </w:pPr>
+            <w:r>
+              <w:rPr>
+                <w:rFonts w:ascii="Times New Roman" w:hAnsi="Times New Roman"/>
+                <w:b/>
+                <w:color w:val="FFFFFF"/>
+                <w:sz w:val="22"/>
+              </w:rPr>
+              <w:t>Mã Node Cảm biến</w:t>
+            </w:r>
+          </w:p>
+        </w:tc>
+        <w:tc>
+          <w:tcPr>
+            <w:tcW w:type="dxa" w:w="1881"/>
+            <w:shd w:val="clear" w:color="auto" w:fill="1F497D"/>
+          </w:tcPr>
+          <w:p>
+            <w:pPr>
+              <w:jc w:val="center"/>
+            </w:pPr>
+            <w:r>
+              <w:rPr>
+                <w:rFonts w:ascii="Times New Roman" w:hAnsi="Times New Roman"/>
+                <w:b/>
+                <w:color w:val="FFFFFF"/>
+                <w:sz w:val="22"/>
+              </w:rPr>
+              <w:t>Phân vùng Triển khai</w:t>
+            </w:r>
+          </w:p>
+        </w:tc>
+        <w:tc>
+          <w:tcPr>
+            <w:tcW w:type="dxa" w:w="1881"/>
+            <w:shd w:val="clear" w:color="auto" w:fill="1F497D"/>
+          </w:tcPr>
+          <w:p>
+            <w:pPr>
+              <w:jc w:val="center"/>
+            </w:pPr>
+            <w:r>
+              <w:rPr>
+                <w:rFonts w:ascii="Times New Roman" w:hAnsi="Times New Roman"/>
+                <w:b/>
+                <w:color w:val="FFFFFF"/>
+                <w:sz w:val="22"/>
+              </w:rPr>
+              <w:t>Dải mạng Subnet</w:t>
+            </w:r>
+          </w:p>
+        </w:tc>
+        <w:tc>
+          <w:tcPr>
+            <w:tcW w:type="dxa" w:w="1881"/>
+            <w:shd w:val="clear" w:color="auto" w:fill="1F497D"/>
+          </w:tcPr>
+          <w:p>
+            <w:pPr>
+              <w:jc w:val="center"/>
+            </w:pPr>
+            <w:r>
+              <w:rPr>
+                <w:rFonts w:ascii="Times New Roman" w:hAnsi="Times New Roman"/>
+                <w:b/>
+                <w:color w:val="FFFFFF"/>
+                <w:sz w:val="22"/>
+              </w:rPr>
+              <w:t>Dịch vụ Bẫy mồi Hoạt động</w:t>
+            </w:r>
+          </w:p>
+        </w:tc>
+        <w:tc>
+          <w:tcPr>
+            <w:tcW w:type="dxa" w:w="1881"/>
+            <w:shd w:val="clear" w:color="auto" w:fill="1F497D"/>
+          </w:tcPr>
+          <w:p>
+            <w:pPr>
+              <w:jc w:val="center"/>
+            </w:pPr>
+            <w:r>
+              <w:rPr>
+                <w:rFonts w:ascii="Times New Roman" w:hAnsi="Times New Roman"/>
+                <w:b/>
+                <w:color w:val="FFFFFF"/>
+                <w:sz w:val="22"/>
+              </w:rPr>
+              <w:t>Loại Mồi nhử Honeytoken</w:t>
+            </w:r>
+          </w:p>
+        </w:tc>
+      </w:tr>
+      <w:tr>
+        <w:tc>
+          <w:tcPr>
+            <w:tcW w:type="dxa" w:w="1881"/>
+          </w:tcPr>
+          <w:p>
+            <w:pPr>
+              <w:jc w:val="center"/>
+            </w:pPr>
+            <w:r>
+              <w:rPr>
+                <w:rFonts w:ascii="Times New Roman" w:hAnsi="Times New Roman"/>
+                <w:sz w:val="21"/>
+              </w:rPr>
+              <w:t>sensor-dmz-01</w:t>
+            </w:r>
+          </w:p>
+        </w:tc>
+        <w:tc>
+          <w:tcPr>
+            <w:tcW w:type="dxa" w:w="1881"/>
+          </w:tcPr>
+          <w:p>
+            <w:pPr>
+              <w:jc w:val="left"/>
+            </w:pPr>
+            <w:r>
+              <w:rPr>
+                <w:rFonts w:ascii="Times New Roman" w:hAnsi="Times New Roman"/>
+                <w:sz w:val="21"/>
+              </w:rPr>
+              <w:t>DMZ Public Web</w:t>
+            </w:r>
+          </w:p>
+        </w:tc>
+        <w:tc>
+          <w:tcPr>
+            <w:tcW w:type="dxa" w:w="1881"/>
+          </w:tcPr>
+          <w:p>
+            <w:pPr>
+              <w:jc w:val="left"/>
+            </w:pPr>
+            <w:r>
+              <w:rPr>
+                <w:rFonts w:ascii="Times New Roman" w:hAnsi="Times New Roman"/>
+                <w:sz w:val="21"/>
+              </w:rPr>
+              <w:t>192.168.10.0/24</w:t>
+            </w:r>
+          </w:p>
+        </w:tc>
+        <w:tc>
+          <w:tcPr>
+            <w:tcW w:type="dxa" w:w="1881"/>
+          </w:tcPr>
+          <w:p>
+            <w:pPr>
+              <w:jc w:val="left"/>
+            </w:pPr>
+            <w:r>
+              <w:rPr>
+                <w:rFonts w:ascii="Times New Roman" w:hAnsi="Times New Roman"/>
+                <w:sz w:val="21"/>
+              </w:rPr>
+              <w:t>Cowrie SSH (Port 2222) + HTTP Canary (8080)</w:t>
+            </w:r>
+          </w:p>
+        </w:tc>
+        <w:tc>
+          <w:tcPr>
+            <w:tcW w:type="dxa" w:w="1881"/>
+          </w:tcPr>
+          <w:p>
+            <w:pPr>
+              <w:jc w:val="left"/>
+            </w:pPr>
+            <w:r>
+              <w:rPr>
+                <w:rFonts w:ascii="Times New Roman" w:hAnsi="Times New Roman"/>
+                <w:sz w:val="21"/>
+              </w:rPr>
+              <w:t>/root/.bash_history, db_backup.sql</w:t>
+            </w:r>
+          </w:p>
+        </w:tc>
+      </w:tr>
+      <w:tr>
+        <w:tc>
+          <w:tcPr>
+            <w:tcW w:type="dxa" w:w="1881"/>
+            <w:shd w:val="clear" w:color="auto" w:fill="F2F5F8"/>
+          </w:tcPr>
+          <w:p>
+            <w:pPr>
+              <w:jc w:val="center"/>
+            </w:pPr>
+            <w:r>
+              <w:rPr>
+                <w:rFonts w:ascii="Times New Roman" w:hAnsi="Times New Roman"/>
+                <w:sz w:val="21"/>
+              </w:rPr>
+              <w:t>sensor-cloud-aws-02</w:t>
+            </w:r>
+          </w:p>
+        </w:tc>
+        <w:tc>
+          <w:tcPr>
+            <w:tcW w:type="dxa" w:w="1881"/>
+            <w:shd w:val="clear" w:color="auto" w:fill="F2F5F8"/>
+          </w:tcPr>
+          <w:p>
+            <w:pPr>
+              <w:jc w:val="left"/>
+            </w:pPr>
+            <w:r>
+              <w:rPr>
+                <w:rFonts w:ascii="Times New Roman" w:hAnsi="Times New Roman"/>
+                <w:sz w:val="21"/>
+              </w:rPr>
+              <w:t>AWS Cloud VPC</w:t>
+            </w:r>
+          </w:p>
+        </w:tc>
+        <w:tc>
+          <w:tcPr>
+            <w:tcW w:type="dxa" w:w="1881"/>
+            <w:shd w:val="clear" w:color="auto" w:fill="F2F5F8"/>
+          </w:tcPr>
+          <w:p>
+            <w:pPr>
+              <w:jc w:val="left"/>
+            </w:pPr>
+            <w:r>
+              <w:rPr>
+                <w:rFonts w:ascii="Times New Roman" w:hAnsi="Times New Roman"/>
+                <w:sz w:val="21"/>
+              </w:rPr>
+              <w:t>10.0.1.0/24</w:t>
+            </w:r>
+          </w:p>
+        </w:tc>
+        <w:tc>
+          <w:tcPr>
+            <w:tcW w:type="dxa" w:w="1881"/>
+            <w:shd w:val="clear" w:color="auto" w:fill="F2F5F8"/>
+          </w:tcPr>
+          <w:p>
+            <w:pPr>
+              <w:jc w:val="left"/>
+            </w:pPr>
+            <w:r>
+              <w:rPr>
+                <w:rFonts w:ascii="Times New Roman" w:hAnsi="Times New Roman"/>
+                <w:sz w:val="21"/>
+              </w:rPr>
+              <w:t>Decoy SSH Shell + Fake Cloud Admin Portal</w:t>
+            </w:r>
+          </w:p>
+        </w:tc>
+        <w:tc>
+          <w:tcPr>
+            <w:tcW w:type="dxa" w:w="1881"/>
+            <w:shd w:val="clear" w:color="auto" w:fill="F2F5F8"/>
+          </w:tcPr>
+          <w:p>
+            <w:pPr>
+              <w:jc w:val="left"/>
+            </w:pPr>
+            <w:r>
+              <w:rPr>
+                <w:rFonts w:ascii="Times New Roman" w:hAnsi="Times New Roman"/>
+                <w:sz w:val="21"/>
+              </w:rPr>
+              <w:t>/root/.aws/credentials (AWS Canary IAM)</w:t>
+            </w:r>
+          </w:p>
+        </w:tc>
+      </w:tr>
+      <w:tr>
+        <w:tc>
+          <w:tcPr>
+            <w:tcW w:type="dxa" w:w="1881"/>
+          </w:tcPr>
+          <w:p>
+            <w:pPr>
+              <w:jc w:val="center"/>
+            </w:pPr>
+            <w:r>
+              <w:rPr>
+                <w:rFonts w:ascii="Times New Roman" w:hAnsi="Times New Roman"/>
+                <w:sz w:val="21"/>
+              </w:rPr>
+              <w:t>sensor-internal-lan-03</w:t>
+            </w:r>
+          </w:p>
+        </w:tc>
+        <w:tc>
+          <w:tcPr>
+            <w:tcW w:type="dxa" w:w="1881"/>
+          </w:tcPr>
+          <w:p>
+            <w:pPr>
+              <w:jc w:val="left"/>
+            </w:pPr>
+            <w:r>
+              <w:rPr>
+                <w:rFonts w:ascii="Times New Roman" w:hAnsi="Times New Roman"/>
+                <w:sz w:val="21"/>
+              </w:rPr>
+              <w:t>Corporate Internal LAN</w:t>
+            </w:r>
+          </w:p>
+        </w:tc>
+        <w:tc>
+          <w:tcPr>
+            <w:tcW w:type="dxa" w:w="1881"/>
+          </w:tcPr>
+          <w:p>
+            <w:pPr>
+              <w:jc w:val="left"/>
+            </w:pPr>
+            <w:r>
+              <w:rPr>
+                <w:rFonts w:ascii="Times New Roman" w:hAnsi="Times New Roman"/>
+                <w:sz w:val="21"/>
+              </w:rPr>
+              <w:t>172.16.0.0/16</w:t>
+            </w:r>
+          </w:p>
+        </w:tc>
+        <w:tc>
+          <w:tcPr>
+            <w:tcW w:type="dxa" w:w="1881"/>
+          </w:tcPr>
+          <w:p>
+            <w:pPr>
+              <w:jc w:val="left"/>
+            </w:pPr>
+            <w:r>
+              <w:rPr>
+                <w:rFonts w:ascii="Times New Roman" w:hAnsi="Times New Roman"/>
+                <w:sz w:val="21"/>
+              </w:rPr>
+              <w:t>Decoy Lateral Port + Fake SMB File Share</w:t>
+            </w:r>
+          </w:p>
+        </w:tc>
+        <w:tc>
+          <w:tcPr>
+            <w:tcW w:type="dxa" w:w="1881"/>
+          </w:tcPr>
+          <w:p>
+            <w:pPr>
+              <w:jc w:val="left"/>
+            </w:pPr>
+            <w:r>
+              <w:rPr>
+                <w:rFonts w:ascii="Times New Roman" w:hAnsi="Times New Roman"/>
+                <w:sz w:val="21"/>
+              </w:rPr>
+              <w:t>Active Directory Decoy Admin SPN</w:t>
+            </w:r>
+          </w:p>
+        </w:tc>
+      </w:tr>
+    </w:tbl>
+    <w:p>
+      <w:pPr>
+        <w:spacing w:before="80" w:after="120"/>
+      </w:pPr>
+    </w:p>
+    <w:tbl>
+      <w:tblPr>
+        <w:tblStyle w:val="TableGrid"/>
+        <w:tblW w:type="auto" w:w="0"/>
+        <w:jc w:val="center"/>
+        <w:tblLook w:firstColumn="1" w:firstRow="1" w:lastColumn="0" w:lastRow="0" w:noHBand="0" w:noVBand="1" w:val="04A0"/>
+        <w:tblCellMar>
+          <w:top w:w="140" w:type="dxa"/>
+          <w:left w:w="180" w:type="dxa"/>
+          <w:bottom w:w="140" w:type="dxa"/>
+          <w:right w:w="180" w:type="dxa"/>
+        </w:tblCellMar>
+      </w:tblPr>
+      <w:tblGrid>
+        <w:gridCol w:w="9403"/>
+      </w:tblGrid>
+      <w:tr>
+        <w:tc>
+          <w:tcPr>
+            <w:tcW w:type="dxa" w:w="9403"/>
+            <w:shd w:val="clear" w:color="auto" w:fill="F0F4F8"/>
+          </w:tcPr>
+          <w:p>
+            <w:pPr>
+              <w:spacing w:before="80" w:after="80"/>
+            </w:pPr>
+            <w:r>
+              <w:rPr>
+                <w:rFonts w:ascii="Times New Roman" w:hAnsi="Times New Roman"/>
+                <w:b/>
+                <w:color w:val="00468C"/>
+                <w:sz w:val="24"/>
+              </w:rPr>
+              <w:t>📌 GHI CHÚ HỌC THUẬT: ĐỘT PHÁ CỦA MÔ HÌNH HONEYNET PHÂN TÁN TRONG TÁC CHIẾN ACTIVE DEFENSE &amp; SOAR:</w:t>
+              <w:br/>
+            </w:r>
+            <w:r>
+              <w:rPr>
+                <w:rFonts w:ascii="Times New Roman" w:hAnsi="Times New Roman"/>
+                <w:i/>
+                <w:color w:val="282828"/>
+                <w:sz w:val="24"/>
+              </w:rPr>
+              <w:t>Kiến trúc Honeynet Phân tán cho phép hệ thống mở rộng từ mô hình bẫy mồi phòng thí nghiệm đơn lẻ thành mạng lưới cảm biến đan xen (Sensor Mesh) cấp doanh nghiệp. Điểm đột phá kỹ thuật nằm ở cơ chế tương quan Cross-Subnet: Kẻ tấn công cho dù sử dụng kỹ thuật trinh sát phân tán chậm (Slow-and-Low Scan) để lẩn tránh IDS/IPS truyền thống vẫn sẽ bị vạch trần ngay khi chạm vào 2 bẫy mồi ở các phân vùng mạng khác nhau.</w:t>
+            </w:r>
+          </w:p>
+        </w:tc>
+      </w:tr>
+    </w:tbl>
+    <w:p>
+      <w:pPr>
+        <w:spacing w:before="40" w:after="80"/>
+      </w:pPr>
     </w:p>
     <w:p>
       <w:r>
@@ -9385,7 +10439,7 @@
         <w:drawing>
           <wp:inline xmlns:a="http://schemas.openxmlformats.org/drawingml/2006/main" xmlns:pic="http://schemas.openxmlformats.org/drawingml/2006/picture">
             <wp:extent cx="5486400" cy="2926080"/>
-            <wp:docPr id="1" name="Picture 1"/>
+            <wp:docPr id="9" name="Picture 9"/>
             <wp:cNvGraphicFramePr>
               <a:graphicFrameLocks noChangeAspect="1"/>
             </wp:cNvGraphicFramePr>
@@ -9397,7 +10451,7 @@
                     <pic:cNvPicPr/>
                   </pic:nvPicPr>
                   <pic:blipFill>
-                    <a:blip r:embed="rId9"/>
+                    <a:blip r:embed="rId17"/>
                     <a:stretch>
                       <a:fillRect/>
                     </a:stretch>
@@ -9427,7 +10481,7 @@
           <w:i/>
           <w:sz w:val="22"/>
         </w:rPr>
-        <w:t>Hình 5.3: Đo lường Hiệu quả Làm chậm &amp; Triệt tiêu Tấn công của Cơ chế Tarpit</w:t>
+        <w:t>Hình 5.1: Đo lường Hiệu quả Làm chậm &amp; Triệt tiêu Tấn công của Cơ chế Tarpit</w:t>
       </w:r>
     </w:p>
     <w:p>
@@ -10024,7 +11078,7 @@
         <w:drawing>
           <wp:inline xmlns:a="http://schemas.openxmlformats.org/drawingml/2006/main" xmlns:pic="http://schemas.openxmlformats.org/drawingml/2006/picture">
             <wp:extent cx="5486400" cy="3048000"/>
-            <wp:docPr id="2" name="Picture 2"/>
+            <wp:docPr id="10" name="Picture 10"/>
             <wp:cNvGraphicFramePr>
               <a:graphicFrameLocks noChangeAspect="1"/>
             </wp:cNvGraphicFramePr>
@@ -10036,7 +11090,7 @@
                     <pic:cNvPicPr/>
                   </pic:nvPicPr>
                   <pic:blipFill>
-                    <a:blip r:embed="rId10"/>
+                    <a:blip r:embed="rId18"/>
                     <a:stretch>
                       <a:fillRect/>
                     </a:stretch>
@@ -10184,7 +11238,7 @@
         <w:drawing>
           <wp:inline xmlns:a="http://schemas.openxmlformats.org/drawingml/2006/main" xmlns:pic="http://schemas.openxmlformats.org/drawingml/2006/picture">
             <wp:extent cx="5486400" cy="2926080"/>
-            <wp:docPr id="3" name="Picture 3"/>
+            <wp:docPr id="11" name="Picture 11"/>
             <wp:cNvGraphicFramePr>
               <a:graphicFrameLocks noChangeAspect="1"/>
             </wp:cNvGraphicFramePr>
@@ -10196,7 +11250,7 @@
                     <pic:cNvPicPr/>
                   </pic:nvPicPr>
                   <pic:blipFill>
-                    <a:blip r:embed="rId11"/>
+                    <a:blip r:embed="rId19"/>
                     <a:stretch>
                       <a:fillRect/>
                     </a:stretch>
@@ -10226,7 +11280,7 @@
           <w:i/>
           <w:sz w:val="22"/>
         </w:rPr>
-        <w:t>Hình 5.1: Biểu đồ phân bố Kỹ thuật Tấn công ghi nhận trên Cowrie (Chuẩn MITRE ATT&amp;CK)</w:t>
+        <w:t>Hình 5.3: Biểu đồ phân bố Kỹ thuật Tấn công ghi nhận trên Cowrie (Chuẩn MITRE ATT&amp;CK)</w:t>
       </w:r>
     </w:p>
     <w:p>

</xml_diff>